<commit_message>
Lesson 1 sheet: match the new investigation layout
Co-authored-by: Cursor <cursoragent@cursor.com>
</commit_message>
<xml_diff>
--- a/lessons/01-made-to-rust/resources/l1-student-sheets-EDITABLE.docx
+++ b/lessons/01-made-to-rust/resources/l1-student-sheets-EDITABLE.docx
@@ -4807,6 +4807,151 @@
           <w:sz w:val="22"/>
           <w:szCs w:val="22"/>
         </w:rPr>
+        <w:t xml:space="preserve">Our prediction</w:t>
+      </w:r>
+    </w:p>
+    <w:p>
+      <w:pPr>
+        <w:spacing w:after="70" w:before="40" w:line="260"/>
+      </w:pPr>
+      <w:r>
+        <w:rPr>
+          <w:rFonts w:ascii="Calibri" w:cs="Calibri" w:eastAsia="Calibri" w:hAnsi="Calibri"/>
+          <w:color w:val="222222"/>
+          <w:sz w:val="19"/>
+          <w:szCs w:val="19"/>
+        </w:rPr>
+        <w:t xml:space="preserve">How much rust will your condition make compared with everyone else’s — most in the room, least, or somewhere in the middle? Say why.</w:t>
+      </w:r>
+    </w:p>
+    <w:tbl>
+      <w:tblPr>
+        <w:tblW w:type="dxa" w:w="9600"/>
+        <w:tblBorders>
+          <w:top w:val="none" w:color="FFFFFF" w:sz="0"/>
+          <w:left w:val="none" w:color="FFFFFF" w:sz="0"/>
+          <w:bottom w:val="none" w:color="FFFFFF" w:sz="0"/>
+          <w:right w:val="none" w:color="FFFFFF" w:sz="0"/>
+          <w:insideH w:val="single" w:color="AEB4C2" w:sz="4"/>
+          <w:insideV w:val="none" w:color="FFFFFF" w:sz="0"/>
+        </w:tblBorders>
+      </w:tblPr>
+      <w:tblGrid>
+        <w:gridCol w:w="9600"/>
+      </w:tblGrid>
+      <w:tr>
+        <w:tc>
+          <w:tcPr>
+            <w:tcW w:type="dxa" w:w="9600"/>
+            <w:tcBorders>
+              <w:top w:val="none" w:color="FFFFFF" w:sz="0"/>
+              <w:left w:val="none" w:color="FFFFFF" w:sz="0"/>
+              <w:bottom w:val="single" w:color="AEB4C2" w:sz="4"/>
+              <w:right w:val="none" w:color="FFFFFF" w:sz="0"/>
+            </w:tcBorders>
+            <w:tcMar>
+              <w:top w:type="dxa" w:w="0"/>
+              <w:left w:type="dxa" w:w="0"/>
+              <w:bottom w:type="dxa" w:w="0"/>
+              <w:right w:type="dxa" w:w="0"/>
+            </w:tcMar>
+          </w:tcPr>
+          <w:p>
+            <w:pPr>
+              <w:spacing w:after="85" w:before="85"/>
+            </w:pPr>
+            <w:r>
+              <w:rPr>
+                <w:rFonts w:ascii="Calibri" w:cs="Calibri" w:eastAsia="Calibri" w:hAnsi="Calibri"/>
+                <w:color w:val="222222"/>
+                <w:sz w:val="20"/>
+                <w:szCs w:val="20"/>
+              </w:rPr>
+              <w:t xml:space="preserve"> </w:t>
+            </w:r>
+          </w:p>
+        </w:tc>
+      </w:tr>
+      <w:tr>
+        <w:tc>
+          <w:tcPr>
+            <w:tcW w:type="dxa" w:w="9600"/>
+            <w:tcBorders>
+              <w:top w:val="none" w:color="FFFFFF" w:sz="0"/>
+              <w:left w:val="none" w:color="FFFFFF" w:sz="0"/>
+              <w:bottom w:val="single" w:color="AEB4C2" w:sz="4"/>
+              <w:right w:val="none" w:color="FFFFFF" w:sz="0"/>
+            </w:tcBorders>
+            <w:tcMar>
+              <w:top w:type="dxa" w:w="0"/>
+              <w:left w:type="dxa" w:w="0"/>
+              <w:bottom w:type="dxa" w:w="0"/>
+              <w:right w:type="dxa" w:w="0"/>
+            </w:tcMar>
+          </w:tcPr>
+          <w:p>
+            <w:pPr>
+              <w:spacing w:after="85" w:before="85"/>
+            </w:pPr>
+            <w:r>
+              <w:rPr>
+                <w:rFonts w:ascii="Calibri" w:cs="Calibri" w:eastAsia="Calibri" w:hAnsi="Calibri"/>
+                <w:color w:val="222222"/>
+                <w:sz w:val="20"/>
+                <w:szCs w:val="20"/>
+              </w:rPr>
+              <w:t xml:space="preserve"> </w:t>
+            </w:r>
+          </w:p>
+        </w:tc>
+      </w:tr>
+      <w:tr>
+        <w:tc>
+          <w:tcPr>
+            <w:tcW w:type="dxa" w:w="9600"/>
+            <w:tcBorders>
+              <w:top w:val="none" w:color="FFFFFF" w:sz="0"/>
+              <w:left w:val="none" w:color="FFFFFF" w:sz="0"/>
+              <w:bottom w:val="single" w:color="AEB4C2" w:sz="4"/>
+              <w:right w:val="none" w:color="FFFFFF" w:sz="0"/>
+            </w:tcBorders>
+            <w:tcMar>
+              <w:top w:type="dxa" w:w="0"/>
+              <w:left w:type="dxa" w:w="0"/>
+              <w:bottom w:type="dxa" w:w="0"/>
+              <w:right w:type="dxa" w:w="0"/>
+            </w:tcMar>
+          </w:tcPr>
+          <w:p>
+            <w:pPr>
+              <w:spacing w:after="85" w:before="85"/>
+            </w:pPr>
+            <w:r>
+              <w:rPr>
+                <w:rFonts w:ascii="Calibri" w:cs="Calibri" w:eastAsia="Calibri" w:hAnsi="Calibri"/>
+                <w:color w:val="222222"/>
+                <w:sz w:val="20"/>
+                <w:szCs w:val="20"/>
+              </w:rPr>
+              <w:t xml:space="preserve"> </w:t>
+            </w:r>
+          </w:p>
+        </w:tc>
+      </w:tr>
+    </w:tbl>
+    <w:p>
+      <w:pPr>
+        <w:spacing w:after="60" w:before="190"/>
+      </w:pPr>
+      <w:r>
+        <w:rPr>
+          <w:rFonts w:ascii="Calibri" w:cs="Calibri" w:eastAsia="Calibri" w:hAnsi="Calibri"/>
+          <w:b/>
+          <w:bCs/>
+          <w:color w:val="0E7C7B"/>
+          <w:sz w:val="22"/>
+          <w:szCs w:val="22"/>
+        </w:rPr>
         <w:t xml:space="preserve">Steps</w:t>
       </w:r>
     </w:p>
@@ -4822,11 +4967,22 @@
       <w:r>
         <w:rPr>
           <w:rFonts w:ascii="Calibri" w:cs="Calibri" w:eastAsia="Calibri" w:hAnsi="Calibri"/>
+          <w:b/>
+          <w:bCs/>
           <w:color w:val="222222"/>
           <w:sz w:val="19"/>
           <w:szCs w:val="19"/>
         </w:rPr>
-        <w:t xml:space="preserve">Collect three jars. Check each one for chips. If it is cracked, swap it.</w:t>
+        <w:t xml:space="preserve">Check your jars.</w:t>
+      </w:r>
+      <w:r>
+        <w:rPr>
+          <w:rFonts w:ascii="Calibri" w:cs="Calibri" w:eastAsia="Calibri" w:hAnsi="Calibri"/>
+          <w:color w:val="222222"/>
+          <w:sz w:val="19"/>
+          <w:szCs w:val="19"/>
+        </w:rPr>
+        <w:t xml:space="preserve"> Any chips or cracks, swap it.</w:t>
       </w:r>
     </w:p>
     <w:p>
@@ -4841,11 +4997,22 @@
       <w:r>
         <w:rPr>
           <w:rFonts w:ascii="Calibri" w:cs="Calibri" w:eastAsia="Calibri" w:hAnsi="Calibri"/>
+          <w:b/>
+          <w:bCs/>
           <w:color w:val="222222"/>
           <w:sz w:val="19"/>
           <w:szCs w:val="19"/>
         </w:rPr>
-        <w:t xml:space="preserve">Weigh your three nails TOGETHER. Write the mass below before they go in the jar.</w:t>
+        <w:t xml:space="preserve">Mark each nail</w:t>
+      </w:r>
+      <w:r>
+        <w:rPr>
+          <w:rFonts w:ascii="Calibri" w:cs="Calibri" w:eastAsia="Calibri" w:hAnsi="Calibri"/>
+          <w:color w:val="222222"/>
+          <w:sz w:val="19"/>
+          <w:szCs w:val="19"/>
+        </w:rPr>
+        <w:t xml:space="preserve"> halfway along with the marker. That line is what “half covered” means — not the jar.</w:t>
       </w:r>
     </w:p>
     <w:p>
@@ -4860,11 +5027,22 @@
       <w:r>
         <w:rPr>
           <w:rFonts w:ascii="Calibri" w:cs="Calibri" w:eastAsia="Calibri" w:hAnsi="Calibri"/>
+          <w:b/>
+          <w:bCs/>
           <w:color w:val="222222"/>
           <w:sz w:val="19"/>
           <w:szCs w:val="19"/>
         </w:rPr>
-        <w:t xml:space="preserve">Set up your condition in all three jars, exactly the same way each time.</w:t>
+        <w:t xml:space="preserve">Weigh 3 nails together.</w:t>
+      </w:r>
+      <w:r>
+        <w:rPr>
+          <w:rFonts w:ascii="Calibri" w:cs="Calibri" w:eastAsia="Calibri" w:hAnsi="Calibri"/>
+          <w:color w:val="222222"/>
+          <w:sz w:val="19"/>
+          <w:szCs w:val="19"/>
+        </w:rPr>
+        <w:t xml:space="preserve"> Write the number in the table below. Do this for each jar.</w:t>
       </w:r>
     </w:p>
     <w:p>
@@ -4879,11 +5057,22 @@
       <w:r>
         <w:rPr>
           <w:rFonts w:ascii="Calibri" w:cs="Calibri" w:eastAsia="Calibri" w:hAnsi="Calibri"/>
+          <w:b/>
+          <w:bCs/>
           <w:color w:val="222222"/>
           <w:sz w:val="19"/>
           <w:szCs w:val="19"/>
         </w:rPr>
-        <w:t xml:space="preserve">Fill in and cut off the three labels at the bottom. Stick one on each jar.</w:t>
+        <w:t xml:space="preserve">Put 3 nails in each jar.</w:t>
+      </w:r>
+      <w:r>
+        <w:rPr>
+          <w:rFonts w:ascii="Calibri" w:cs="Calibri" w:eastAsia="Calibri" w:hAnsi="Calibri"/>
+          <w:color w:val="222222"/>
+          <w:sz w:val="19"/>
+          <w:szCs w:val="19"/>
+        </w:rPr>
+        <w:t xml:space="preserve"/>
       </w:r>
     </w:p>
     <w:p>
@@ -4898,11 +5087,142 @@
       <w:r>
         <w:rPr>
           <w:rFonts w:ascii="Calibri" w:cs="Calibri" w:eastAsia="Calibri" w:hAnsi="Calibri"/>
+          <w:b/>
+          <w:bCs/>
           <w:color w:val="222222"/>
           <w:sz w:val="19"/>
           <w:szCs w:val="19"/>
         </w:rPr>
-        <w:t xml:space="preserve">Write the repeat sentence. Then put the jars on the shelf.</w:t>
+        <w:t xml:space="preserve">Set up your condition</w:t>
+      </w:r>
+      <w:r>
+        <w:rPr>
+          <w:rFonts w:ascii="Calibri" w:cs="Calibri" w:eastAsia="Calibri" w:hAnsi="Calibri"/>
+          <w:color w:val="222222"/>
+          <w:sz w:val="19"/>
+          <w:szCs w:val="19"/>
+        </w:rPr>
+        <w:t xml:space="preserve"> in all 3 jars, the same way every time. Half covered = water to the marker line. Fully covered = at least 1 cm over the nail.</w:t>
+      </w:r>
+    </w:p>
+    <w:p>
+      <w:pPr>
+        <w:pStyle w:val="ListParagraph"/>
+        <w:numPr>
+          <w:ilvl w:val="0"/>
+          <w:numId w:val="3"/>
+        </w:numPr>
+        <w:spacing w:after="35" w:before="35" w:line="258"/>
+      </w:pPr>
+      <w:r>
+        <w:rPr>
+          <w:rFonts w:ascii="Calibri" w:cs="Calibri" w:eastAsia="Calibri" w:hAnsi="Calibri"/>
+          <w:b/>
+          <w:bCs/>
+          <w:color w:val="222222"/>
+          <w:sz w:val="19"/>
+          <w:szCs w:val="19"/>
+        </w:rPr>
+        <w:t xml:space="preserve">Draw a line on the outside</w:t>
+      </w:r>
+      <w:r>
+        <w:rPr>
+          <w:rFonts w:ascii="Calibri" w:cs="Calibri" w:eastAsia="Calibri" w:hAnsi="Calibri"/>
+          <w:color w:val="222222"/>
+          <w:sz w:val="19"/>
+          <w:szCs w:val="19"/>
+        </w:rPr>
+        <w:t xml:space="preserve"> of each jar where the water comes to. You top it back up to that line every week.</w:t>
+      </w:r>
+    </w:p>
+    <w:p>
+      <w:pPr>
+        <w:pStyle w:val="ListParagraph"/>
+        <w:numPr>
+          <w:ilvl w:val="0"/>
+          <w:numId w:val="3"/>
+        </w:numPr>
+        <w:spacing w:after="35" w:before="35" w:line="258"/>
+      </w:pPr>
+      <w:r>
+        <w:rPr>
+          <w:rFonts w:ascii="Calibri" w:cs="Calibri" w:eastAsia="Calibri" w:hAnsi="Calibri"/>
+          <w:b/>
+          <w:bCs/>
+          <w:color w:val="222222"/>
+          <w:sz w:val="19"/>
+          <w:szCs w:val="19"/>
+        </w:rPr>
+        <w:t xml:space="preserve">Fill in and cut off the labels</w:t>
+      </w:r>
+      <w:r>
+        <w:rPr>
+          <w:rFonts w:ascii="Calibri" w:cs="Calibri" w:eastAsia="Calibri" w:hAnsi="Calibri"/>
+          <w:color w:val="222222"/>
+          <w:sz w:val="19"/>
+          <w:szCs w:val="19"/>
+        </w:rPr>
+        <w:t xml:space="preserve"> at the bottom. Stick one on each jar.</w:t>
+      </w:r>
+    </w:p>
+    <w:p>
+      <w:pPr>
+        <w:pStyle w:val="ListParagraph"/>
+        <w:numPr>
+          <w:ilvl w:val="0"/>
+          <w:numId w:val="3"/>
+        </w:numPr>
+        <w:spacing w:after="35" w:before="35" w:line="258"/>
+      </w:pPr>
+      <w:r>
+        <w:rPr>
+          <w:rFonts w:ascii="Calibri" w:cs="Calibri" w:eastAsia="Calibri" w:hAnsi="Calibri"/>
+          <w:b/>
+          <w:bCs/>
+          <w:color w:val="222222"/>
+          <w:sz w:val="19"/>
+          <w:szCs w:val="19"/>
+        </w:rPr>
+        <w:t xml:space="preserve">Lid on or off?</w:t>
+      </w:r>
+      <w:r>
+        <w:rPr>
+          <w:rFonts w:ascii="Calibri" w:cs="Calibri" w:eastAsia="Calibri" w:hAnsi="Calibri"/>
+          <w:color w:val="222222"/>
+          <w:sz w:val="19"/>
+          <w:szCs w:val="19"/>
+        </w:rPr>
+        <w:t xml:space="preserve"> Only Tuesday A and F get a lid. Everything else stays open.</w:t>
+      </w:r>
+    </w:p>
+    <w:p>
+      <w:pPr>
+        <w:pStyle w:val="ListParagraph"/>
+        <w:numPr>
+          <w:ilvl w:val="0"/>
+          <w:numId w:val="3"/>
+        </w:numPr>
+        <w:spacing w:after="35" w:before="35" w:line="258"/>
+      </w:pPr>
+      <w:r>
+        <w:rPr>
+          <w:rFonts w:ascii="Calibri" w:cs="Calibri" w:eastAsia="Calibri" w:hAnsi="Calibri"/>
+          <w:b/>
+          <w:bCs/>
+          <w:color w:val="222222"/>
+          <w:sz w:val="19"/>
+          <w:szCs w:val="19"/>
+        </w:rPr>
+        <w:t xml:space="preserve">Write the repeat sentence.</w:t>
+      </w:r>
+      <w:r>
+        <w:rPr>
+          <w:rFonts w:ascii="Calibri" w:cs="Calibri" w:eastAsia="Calibri" w:hAnsi="Calibri"/>
+          <w:color w:val="222222"/>
+          <w:sz w:val="19"/>
+          <w:szCs w:val="19"/>
+        </w:rPr>
+        <w:t xml:space="preserve"> Then put the jars on the shelf.</w:t>
       </w:r>
     </w:p>
     <w:p>
@@ -5387,151 +5707,6 @@
     </w:p>
     <w:p>
       <w:pPr>
-        <w:spacing w:after="60" w:before="190"/>
-      </w:pPr>
-      <w:r>
-        <w:rPr>
-          <w:rFonts w:ascii="Calibri" w:cs="Calibri" w:eastAsia="Calibri" w:hAnsi="Calibri"/>
-          <w:b/>
-          <w:bCs/>
-          <w:color w:val="0E7C7B"/>
-          <w:sz w:val="22"/>
-          <w:szCs w:val="22"/>
-        </w:rPr>
-        <w:t xml:space="preserve">Our prediction</w:t>
-      </w:r>
-    </w:p>
-    <w:p>
-      <w:pPr>
-        <w:spacing w:after="70" w:before="40" w:line="260"/>
-      </w:pPr>
-      <w:r>
-        <w:rPr>
-          <w:rFonts w:ascii="Calibri" w:cs="Calibri" w:eastAsia="Calibri" w:hAnsi="Calibri"/>
-          <w:color w:val="222222"/>
-          <w:sz w:val="19"/>
-          <w:szCs w:val="19"/>
-        </w:rPr>
-        <w:t xml:space="preserve">Which condition do you think will rust the most, and why?</w:t>
-      </w:r>
-    </w:p>
-    <w:tbl>
-      <w:tblPr>
-        <w:tblW w:type="dxa" w:w="9600"/>
-        <w:tblBorders>
-          <w:top w:val="none" w:color="FFFFFF" w:sz="0"/>
-          <w:left w:val="none" w:color="FFFFFF" w:sz="0"/>
-          <w:bottom w:val="none" w:color="FFFFFF" w:sz="0"/>
-          <w:right w:val="none" w:color="FFFFFF" w:sz="0"/>
-          <w:insideH w:val="single" w:color="AEB4C2" w:sz="4"/>
-          <w:insideV w:val="none" w:color="FFFFFF" w:sz="0"/>
-        </w:tblBorders>
-      </w:tblPr>
-      <w:tblGrid>
-        <w:gridCol w:w="9600"/>
-      </w:tblGrid>
-      <w:tr>
-        <w:tc>
-          <w:tcPr>
-            <w:tcW w:type="dxa" w:w="9600"/>
-            <w:tcBorders>
-              <w:top w:val="none" w:color="FFFFFF" w:sz="0"/>
-              <w:left w:val="none" w:color="FFFFFF" w:sz="0"/>
-              <w:bottom w:val="single" w:color="AEB4C2" w:sz="4"/>
-              <w:right w:val="none" w:color="FFFFFF" w:sz="0"/>
-            </w:tcBorders>
-            <w:tcMar>
-              <w:top w:type="dxa" w:w="0"/>
-              <w:left w:type="dxa" w:w="0"/>
-              <w:bottom w:type="dxa" w:w="0"/>
-              <w:right w:type="dxa" w:w="0"/>
-            </w:tcMar>
-          </w:tcPr>
-          <w:p>
-            <w:pPr>
-              <w:spacing w:after="85" w:before="85"/>
-            </w:pPr>
-            <w:r>
-              <w:rPr>
-                <w:rFonts w:ascii="Calibri" w:cs="Calibri" w:eastAsia="Calibri" w:hAnsi="Calibri"/>
-                <w:color w:val="222222"/>
-                <w:sz w:val="20"/>
-                <w:szCs w:val="20"/>
-              </w:rPr>
-              <w:t xml:space="preserve"> </w:t>
-            </w:r>
-          </w:p>
-        </w:tc>
-      </w:tr>
-      <w:tr>
-        <w:tc>
-          <w:tcPr>
-            <w:tcW w:type="dxa" w:w="9600"/>
-            <w:tcBorders>
-              <w:top w:val="none" w:color="FFFFFF" w:sz="0"/>
-              <w:left w:val="none" w:color="FFFFFF" w:sz="0"/>
-              <w:bottom w:val="single" w:color="AEB4C2" w:sz="4"/>
-              <w:right w:val="none" w:color="FFFFFF" w:sz="0"/>
-            </w:tcBorders>
-            <w:tcMar>
-              <w:top w:type="dxa" w:w="0"/>
-              <w:left w:type="dxa" w:w="0"/>
-              <w:bottom w:type="dxa" w:w="0"/>
-              <w:right w:type="dxa" w:w="0"/>
-            </w:tcMar>
-          </w:tcPr>
-          <w:p>
-            <w:pPr>
-              <w:spacing w:after="85" w:before="85"/>
-            </w:pPr>
-            <w:r>
-              <w:rPr>
-                <w:rFonts w:ascii="Calibri" w:cs="Calibri" w:eastAsia="Calibri" w:hAnsi="Calibri"/>
-                <w:color w:val="222222"/>
-                <w:sz w:val="20"/>
-                <w:szCs w:val="20"/>
-              </w:rPr>
-              <w:t xml:space="preserve"> </w:t>
-            </w:r>
-          </w:p>
-        </w:tc>
-      </w:tr>
-      <w:tr>
-        <w:tc>
-          <w:tcPr>
-            <w:tcW w:type="dxa" w:w="9600"/>
-            <w:tcBorders>
-              <w:top w:val="none" w:color="FFFFFF" w:sz="0"/>
-              <w:left w:val="none" w:color="FFFFFF" w:sz="0"/>
-              <w:bottom w:val="single" w:color="AEB4C2" w:sz="4"/>
-              <w:right w:val="none" w:color="FFFFFF" w:sz="0"/>
-            </w:tcBorders>
-            <w:tcMar>
-              <w:top w:type="dxa" w:w="0"/>
-              <w:left w:type="dxa" w:w="0"/>
-              <w:bottom w:type="dxa" w:w="0"/>
-              <w:right w:type="dxa" w:w="0"/>
-            </w:tcMar>
-          </w:tcPr>
-          <w:p>
-            <w:pPr>
-              <w:spacing w:after="85" w:before="85"/>
-            </w:pPr>
-            <w:r>
-              <w:rPr>
-                <w:rFonts w:ascii="Calibri" w:cs="Calibri" w:eastAsia="Calibri" w:hAnsi="Calibri"/>
-                <w:color w:val="222222"/>
-                <w:sz w:val="20"/>
-                <w:szCs w:val="20"/>
-              </w:rPr>
-              <w:t xml:space="preserve"> </w:t>
-            </w:r>
-          </w:p>
-        </w:tc>
-      </w:tr>
-    </w:tbl>
-    <w:p>
-      <w:pPr>
         <w:spacing w:after="120"/>
       </w:pPr>
     </w:p>
@@ -5621,7 +5796,7 @@
                 <w:sz w:val="17"/>
                 <w:szCs w:val="17"/>
               </w:rPr>
-              <w:t xml:space="preserve">Condition: __________</w:t>
+              <w:t xml:space="preserve">Condition: _______   Jar size: _______</w:t>
             </w:r>
           </w:p>
           <w:p>
@@ -5721,7 +5896,7 @@
                 <w:sz w:val="17"/>
                 <w:szCs w:val="17"/>
               </w:rPr>
-              <w:t xml:space="preserve">Condition: __________</w:t>
+              <w:t xml:space="preserve">Condition: _______   Jar size: _______</w:t>
             </w:r>
           </w:p>
           <w:p>
@@ -5821,7 +5996,7 @@
                 <w:sz w:val="17"/>
                 <w:szCs w:val="17"/>
               </w:rPr>
-              <w:t xml:space="preserve">Condition: __________</w:t>
+              <w:t xml:space="preserve">Condition: _______   Jar size: _______</w:t>
             </w:r>
           </w:p>
           <w:p>
@@ -5871,6 +6046,31 @@
         </w:tc>
       </w:tr>
     </w:tbl>
+    <w:p>
+      <w:pPr>
+        <w:spacing w:after="60" w:before="60" w:line="250"/>
+      </w:pPr>
+      <w:r>
+        <w:rPr>
+          <w:rFonts w:ascii="Calibri" w:cs="Calibri" w:eastAsia="Calibri" w:hAnsi="Calibri"/>
+          <w:b/>
+          <w:bCs/>
+          <w:color w:val="0E7C7B"/>
+          <w:sz w:val="17"/>
+          <w:szCs w:val="17"/>
+        </w:rPr>
+        <w:t xml:space="preserve">Jar G group  </w:t>
+      </w:r>
+      <w:r>
+        <w:rPr>
+          <w:rFonts w:ascii="Calibri" w:cs="Calibri" w:eastAsia="Calibri" w:hAnsi="Calibri"/>
+          <w:color w:val="222222"/>
+          <w:sz w:val="17"/>
+          <w:szCs w:val="17"/>
+        </w:rPr>
+        <w:t xml:space="preserve">You have a fourth jar. Write your own label for it: Jar 4 of 4, condition G, and the mass of the three ordinary nails only.</w:t>
+      </w:r>
+    </w:p>
     <w:p>
       <w:pPr>
         <w:pBdr>

</xml_diff>